<commit_message>
Audit fixes: Instagram bio article
Co-Authored-By: Claude Opus 5.5 <noreply@anthropic.com>
Claude-Session: https://claude.ai/code/session_01GQXcnZLn4f9MkUS7SEqp5J
</commit_message>
<xml_diff>
--- a/blog-content/Instagram-Bio-Ideas-for-Business.docx
+++ b/blog-content/Instagram-Bio-Ideas-for-Business.docx
@@ -153,7 +153,7 @@
         </w:rPr>
         <w:t xml:space="preserve">This guide gives you 18 bios for six types of business, a four-line formula to write your own, and the profile settings that do the work 150 characters can't. It's part of our </w:t>
       </w:r>
-      <w:hyperlink w:history="1" r:id="rIdzyw_heuxiyk1caplotpdz">
+      <w:hyperlink w:history="1" r:id="rIdzadoppz9napiniqhv7y39">
         <w:r>
           <w:rPr>
             <w:rStyle w:val="Hyperlink"/>
@@ -2155,7 +2155,7 @@
         </w:rPr>
         <w:t xml:space="preserve">If you'd rather start from a draft, our free </w:t>
       </w:r>
-      <w:hyperlink w:history="1" r:id="rIdlj51hsy4qkrgmx4snpcv5">
+      <w:hyperlink w:history="1" r:id="rIdmm3psfqoxovr8hsb7mpjf">
         <w:r>
           <w:rPr>
             <w:rStyle w:val="Hyperlink"/>
@@ -2206,7 +2206,7 @@
           <w:sz w:val="24"/>
           <w:szCs w:val="24"/>
         </w:rPr>
-        <w:t xml:space="preserve">Write your name field first, then the four lines, then check the result on your phone. It takes about 15 minutes.</w:t>
+        <w:t xml:space="preserve">Write your name field first, then the four lines, then check the result on your phone.</w:t>
       </w:r>
     </w:p>
     <w:p>
@@ -2492,7 +2492,7 @@
           <w:sz w:val="24"/>
           <w:szCs w:val="24"/>
         </w:rPr>
-        <w:t xml:space="preserve">Save the bio and view your profile from another account or ask someone to look. Check that the lines break where you meant, that emojis don't replace important words and that the whole bio shows without tapping "more". Bios over a few lines can be cut off on some screens.</w:t>
+        <w:t xml:space="preserve">Save the bio and view your profile from another account or ask someone to look. Check that the lines break where you meant and that emojis don't replace important words. To start a new line, press return on your phone's keyboard while editing the bio.</w:t>
       </w:r>
     </w:p>
     <w:p>
@@ -2523,7 +2523,7 @@
           <w:sz w:val="24"/>
           <w:szCs w:val="24"/>
         </w:rPr>
-        <w:t xml:space="preserve">Most weak bios describe a feeling instead of the business. Here's an illustration: a typical salon bio, rewritten with the formula.</w:t>
+        <w:t xml:space="preserve">Many weak bios describe a feeling instead of the business. Here's an illustration: a typical salon bio, rewritten with the formula.</w:t>
       </w:r>
     </w:p>
     <w:p>
@@ -2713,7 +2713,7 @@
           <w:sz w:val="24"/>
           <w:szCs w:val="24"/>
         </w:rPr>
-        <w:t xml:space="preserve"> Fewer people message to ask a question they could answer themselves.</w:t>
+        <w:t xml:space="preserve"> Visitors can book straight away instead of waiting for a reply.</w:t>
       </w:r>
     </w:p>
     <w:p>
@@ -2775,7 +2775,7 @@
         </w:rPr>
         <w:t xml:space="preserve">You can add up to five links to your Instagram bio. Instagram launched the feature in April 2023, as </w:t>
       </w:r>
-      <w:hyperlink w:history="1" r:id="rIdixbpypo6wwsmjoxtvc1cm">
+      <w:hyperlink w:history="1" r:id="rIdhsogfd8m74xxc-k4snujs">
         <w:r>
           <w:rPr>
             <w:rStyle w:val="Hyperlink"/>
@@ -2989,16 +2989,16 @@
           <w:sz w:val="24"/>
           <w:szCs w:val="24"/>
         </w:rPr>
-        <w:t xml:space="preserve">Category.</w:t>
-      </w:r>
-      <w:r>
-        <w:rPr>
-          <w:rFonts w:ascii="Calibri" w:cs="Calibri" w:eastAsia="Calibri" w:hAnsi="Calibri"/>
-          <w:color w:val="333333"/>
-          <w:sz w:val="24"/>
-          <w:szCs w:val="24"/>
-        </w:rPr>
-        <w:t xml:space="preserve"> Professional accounts can show a label such as "Bakery" or "Accountant" under the name. Pick the closest match so visitors understand your business before reading the bio.</w:t>
+        <w:t xml:space="preserve">Profile photo.</w:t>
+      </w:r>
+      <w:r>
+        <w:rPr>
+          <w:rFonts w:ascii="Calibri" w:cs="Calibri" w:eastAsia="Calibri" w:hAnsi="Calibri"/>
+          <w:color w:val="333333"/>
+          <w:sz w:val="24"/>
+          <w:szCs w:val="24"/>
+        </w:rPr>
+        <w:t xml:space="preserve"> Use your logo for a brand, or a clear headshot if customers buy from you as a person. It shows as a small circle, so keep it simple.</w:t>
       </w:r>
     </w:p>
     <w:p>
@@ -3018,16 +3018,16 @@
           <w:sz w:val="24"/>
           <w:szCs w:val="24"/>
         </w:rPr>
-        <w:t xml:space="preserve">Contact and action buttons.</w:t>
-      </w:r>
-      <w:r>
-        <w:rPr>
-          <w:rFonts w:ascii="Calibri" w:cs="Calibri" w:eastAsia="Calibri" w:hAnsi="Calibri"/>
-          <w:color w:val="333333"/>
-          <w:sz w:val="24"/>
-          <w:szCs w:val="24"/>
-        </w:rPr>
-        <w:t xml:space="preserve"> Add the ways customers actually contact you: call, email, directions or a booking button. Then you don't need your phone number in the bio text.</w:t>
+        <w:t xml:space="preserve">Category.</w:t>
+      </w:r>
+      <w:r>
+        <w:rPr>
+          <w:rFonts w:ascii="Calibri" w:cs="Calibri" w:eastAsia="Calibri" w:hAnsi="Calibri"/>
+          <w:color w:val="333333"/>
+          <w:sz w:val="24"/>
+          <w:szCs w:val="24"/>
+        </w:rPr>
+        <w:t xml:space="preserve"> Professional accounts can show a label such as "Bakery" or "Accountant" under the name. Pick the closest match so visitors understand your business before reading the bio.</w:t>
       </w:r>
     </w:p>
     <w:p>
@@ -3047,16 +3047,16 @@
           <w:sz w:val="24"/>
           <w:szCs w:val="24"/>
         </w:rPr>
-        <w:t xml:space="preserve">Story Highlights.</w:t>
-      </w:r>
-      <w:r>
-        <w:rPr>
-          <w:rFonts w:ascii="Calibri" w:cs="Calibri" w:eastAsia="Calibri" w:hAnsi="Calibri"/>
-          <w:color w:val="333333"/>
-          <w:sz w:val="24"/>
-          <w:szCs w:val="24"/>
-        </w:rPr>
-        <w:t xml:space="preserve"> Use them for prices, FAQs, reviews and how to order. Name them clearly ("Prices", "Reviews") so people find them.</w:t>
+        <w:t xml:space="preserve">Contact and action buttons.</w:t>
+      </w:r>
+      <w:r>
+        <w:rPr>
+          <w:rFonts w:ascii="Calibri" w:cs="Calibri" w:eastAsia="Calibri" w:hAnsi="Calibri"/>
+          <w:color w:val="333333"/>
+          <w:sz w:val="24"/>
+          <w:szCs w:val="24"/>
+        </w:rPr>
+        <w:t xml:space="preserve"> Add the ways customers actually contact you: call, email, directions or a booking button. Then you don't need your phone number in the bio text.</w:t>
       </w:r>
     </w:p>
     <w:p>
@@ -3076,16 +3076,16 @@
           <w:sz w:val="24"/>
           <w:szCs w:val="24"/>
         </w:rPr>
-        <w:t xml:space="preserve">Pinned posts.</w:t>
-      </w:r>
-      <w:r>
-        <w:rPr>
-          <w:rFonts w:ascii="Calibri" w:cs="Calibri" w:eastAsia="Calibri" w:hAnsi="Calibri"/>
-          <w:color w:val="333333"/>
-          <w:sz w:val="24"/>
-          <w:szCs w:val="24"/>
-        </w:rPr>
-        <w:t xml:space="preserve"> Pin up to three posts that answer the next question: your best-selling product, a client result or how to book.</w:t>
+        <w:t xml:space="preserve">Story Highlights.</w:t>
+      </w:r>
+      <w:r>
+        <w:rPr>
+          <w:rFonts w:ascii="Calibri" w:cs="Calibri" w:eastAsia="Calibri" w:hAnsi="Calibri"/>
+          <w:color w:val="333333"/>
+          <w:sz w:val="24"/>
+          <w:szCs w:val="24"/>
+        </w:rPr>
+        <w:t xml:space="preserve"> Use them for prices, FAQs, reviews and how to order. Name them clearly ("Prices", "Reviews") so people find them.</w:t>
       </w:r>
     </w:p>
     <w:p>
@@ -3105,6 +3105,35 @@
           <w:sz w:val="24"/>
           <w:szCs w:val="24"/>
         </w:rPr>
+        <w:t xml:space="preserve">Pinned posts.</w:t>
+      </w:r>
+      <w:r>
+        <w:rPr>
+          <w:rFonts w:ascii="Calibri" w:cs="Calibri" w:eastAsia="Calibri" w:hAnsi="Calibri"/>
+          <w:color w:val="333333"/>
+          <w:sz w:val="24"/>
+          <w:szCs w:val="24"/>
+        </w:rPr>
+        <w:t xml:space="preserve"> Instagram lets you pin up to three posts or Reels to the top of your grid. Pin ones that answer the next question: your best-selling product, a client result or how to book.</w:t>
+      </w:r>
+    </w:p>
+    <w:p>
+      <w:pPr>
+        <w:pStyle w:val="ListParagraph"/>
+        <w:numPr>
+          <w:ilvl w:val="0"/>
+          <w:numId w:val="1"/>
+        </w:numPr>
+      </w:pPr>
+      <w:r>
+        <w:rPr>
+          <w:rFonts w:ascii="Calibri" w:cs="Calibri" w:eastAsia="Calibri" w:hAnsi="Calibri"/>
+          <w:b/>
+          <w:bCs/>
+          <w:color w:val="333333"/>
+          <w:sz w:val="24"/>
+          <w:szCs w:val="24"/>
+        </w:rPr>
         <w:t xml:space="preserve">Branded hashtag.</w:t>
       </w:r>
       <w:r>
@@ -3116,7 +3145,7 @@
         </w:rPr>
         <w:t xml:space="preserve"> If customers post about you, add your branded hashtag to the bio so their photos are one tap away. Our guide to </w:t>
       </w:r>
-      <w:hyperlink w:history="1" r:id="rIdmczhr_llawilutgcwnvos">
+      <w:hyperlink w:history="1" r:id="rIdtpyhuo0ca8sbrdlaxf_zf">
         <w:r>
           <w:rPr>
             <w:rStyle w:val="Hyperlink"/>
@@ -3285,7 +3314,7 @@
         </w:rPr>
         <w:t xml:space="preserve"> Screen readers read each emoji's description aloud, so a bio like "🍕 + 🍺 = ❤️" becomes confusing. The University of Kentucky's </w:t>
       </w:r>
-      <w:hyperlink w:history="1" r:id="rIdduzxa9wz2jxd31fbs-tq8">
+      <w:hyperlink w:history="1" r:id="rIdum5guva8tgtqfv8wzgjzz">
         <w:r>
           <w:rPr>
             <w:rStyle w:val="Hyperlink"/>
@@ -3538,7 +3567,7 @@
           <w:sz w:val="28"/>
           <w:szCs w:val="28"/>
         </w:rPr>
-        <w:t xml:space="preserve">Should you add pronouns to a business profile?</w:t>
+        <w:t xml:space="preserve">How do you change your Instagram bio?</w:t>
       </w:r>
     </w:p>
     <w:p>
@@ -3552,7 +3581,7 @@
           <w:sz w:val="24"/>
           <w:szCs w:val="24"/>
         </w:rPr>
-        <w:t xml:space="preserve">It's optional. Pronouns suit a personal brand where you are the business, such as a coach or creator. For a business account with a team, they usually aren't needed. Instagram shows them next to your name, and you can choose who sees them.</w:t>
+        <w:t xml:space="preserve">Go to your profile, tap Edit profile, then tap Bio. Type your new text, then tap Done or the tick to save. Changes show straight away.</w:t>
       </w:r>
     </w:p>
     <w:p>
@@ -3569,7 +3598,7 @@
           <w:sz w:val="28"/>
           <w:szCs w:val="28"/>
         </w:rPr>
-        <w:t xml:space="preserve">How often should you change your Instagram bio?</w:t>
+        <w:t xml:space="preserve">Should you add pronouns to a business profile?</w:t>
       </w:r>
     </w:p>
     <w:p>
@@ -3583,7 +3612,60 @@
           <w:sz w:val="24"/>
           <w:szCs w:val="24"/>
         </w:rPr>
-        <w:t xml:space="preserve">Update it whenever something it mentions changes, such as hours, offers or your main link. Beyond that, leave it alone long enough to measure, about two weeks per change, so you can tell what worked.</w:t>
+        <w:t xml:space="preserve">It's optional. Pronouns suit a personal brand where you are the business, such as a coach or creator. For a business account with a team, they usually aren't needed. You can add up to four in Edit profile, and turn on "Show to followers only" if you don't want everyone to see them, as </w:t>
+      </w:r>
+      <w:hyperlink w:history="1" r:id="rId7x5bvufj74wpak4plmcn6">
+        <w:r>
+          <w:rPr>
+            <w:rStyle w:val="Hyperlink"/>
+            <w:rFonts w:ascii="Calibri" w:cs="Calibri" w:eastAsia="Calibri" w:hAnsi="Calibri"/>
+            <w:color w:val="0563C1"/>
+            <w:sz w:val="24"/>
+            <w:szCs w:val="24"/>
+            <w:u w:val="single"/>
+          </w:rPr>
+          <w:t xml:space="preserve">Instagram's Help Centre</w:t>
+        </w:r>
+      </w:hyperlink>
+      <w:r>
+        <w:rPr>
+          <w:rFonts w:ascii="Calibri" w:cs="Calibri" w:eastAsia="Calibri" w:hAnsi="Calibri"/>
+          <w:color w:val="333333"/>
+          <w:sz w:val="24"/>
+          <w:szCs w:val="24"/>
+        </w:rPr>
+        <w:t xml:space="preserve"> explains.</w:t>
+      </w:r>
+    </w:p>
+    <w:p>
+      <w:pPr>
+        <w:pStyle w:val="Heading3"/>
+        <w:spacing w:after="80" w:before="200"/>
+      </w:pPr>
+      <w:r>
+        <w:rPr>
+          <w:rFonts w:ascii="Calibri" w:cs="Calibri" w:eastAsia="Calibri" w:hAnsi="Calibri"/>
+          <w:b/>
+          <w:bCs/>
+          <w:color w:val="333333"/>
+          <w:sz w:val="28"/>
+          <w:szCs w:val="28"/>
+        </w:rPr>
+        <w:t xml:space="preserve">Can you tag another account in your bio?</w:t>
+      </w:r>
+    </w:p>
+    <w:p>
+      <w:pPr>
+        <w:spacing w:after="160"/>
+      </w:pPr>
+      <w:r>
+        <w:rPr>
+          <w:rFonts w:ascii="Calibri" w:cs="Calibri" w:eastAsia="Calibri" w:hAnsi="Calibri"/>
+          <w:color w:val="333333"/>
+          <w:sz w:val="24"/>
+          <w:szCs w:val="24"/>
+        </w:rPr>
+        <w:t xml:space="preserve">Yes. Type @ followed by the username and it becomes a link to that profile. It's useful for a founder's personal account, a second location or a sister brand. Only tag accounts you want visitors to leave your profile for.</w:t>
       </w:r>
     </w:p>
     <w:p>

</xml_diff>